<commit_message>
update 5th to 4th
</commit_message>
<xml_diff>
--- a/F1TENTH-UCI-Sponsor-Emails.docx
+++ b/F1TENTH-UCI-Sponsor-Emails.docx
@@ -75,7 +75,7 @@
         <ns0:t xml:space="preserve"> </ns0:t>
       </ns0:r>
       <ns0:r>
-        <ns0:t xml:space="preserve">Help F1TENTH@UCI build on a fifth-place international finish</ns0:t>
+        <ns0:t xml:space="preserve">Help F1TENTH@UCI build on a fourth-place international finish</ns0:t>
       </ns0:r>
     </ns0:p>
     <ns0:p>
@@ -91,7 +91,7 @@
         <ns0:pStyle ns0:val="BodyText"/>
       </ns0:pPr>
       <ns0:r>
-        <ns0:t xml:space="preserve">I’m [Your Name], [Role] with F1TENTH@UCI, the autonomous racing team at the University of California, Irvine. We design, build, and race 1:10-scale self-driving cars, and our team placed fifth internationally at an IEEE F1TENTH competition.</ns0:t>
+        <ns0:t xml:space="preserve">I’m [Your Name], [Role] with F1TENTH@UCI, the autonomous racing team at the University of California, Irvine. We design, build, and race 1:10-scale self-driving cars, and our team placed fourth internationally at an IEEE F1TENTH competition.</ns0:t>
       </ns0:r>
     </ns0:p>
     <ns0:p>
@@ -201,7 +201,7 @@
         <ns0:pStyle ns0:val="BodyText"/>
       </ns0:pPr>
       <ns0:r>
-        <ns0:t xml:space="preserve">I’m [Your Name], [Role] with F1TENTH@UCI, UC Irvine’s autonomous racing team. We build and compete with 1:10-scale self-driving cars and placed fifth internationally at an IEEE F1TENTH competition.</ns0:t>
+        <ns0:t xml:space="preserve">I’m [Your Name], [Role] with F1TENTH@UCI, UC Irvine’s autonomous racing team. We build and compete with 1:10-scale self-driving cars and placed fourth internationally at an IEEE F1TENTH competition.</ns0:t>
       </ns0:r>
     </ns0:p>
     <ns0:p>
@@ -311,7 +311,7 @@
         <ns0:pStyle ns0:val="BodyText"/>
       </ns0:pPr>
       <ns0:r>
-        <ns0:t xml:space="preserve">I’m following up on my note about supporting F1TENTH@UCI. We’re seeking financial and equipment sponsors to help our UC Irvine students develop autonomous race cars and build on our fifth-place international finish at an IEEE F1TENTH competition.</ns0:t>
+        <ns0:t xml:space="preserve">I’m following up on my note about supporting F1TENTH@UCI. We’re seeking financial and equipment sponsors to help our UC Irvine students develop autonomous race cars and build on our fourth-place international finish at an IEEE F1TENTH competition.</ns0:t>
       </ns0:r>
     </ns0:p>
     <ns0:p>

</xml_diff>